<commit_message>
Balance option lengths across all MCQ items
Rewrite options and distractors so lengths are comparable (max/min ratio
<= 1.33, key no longer systematically longest). Item 19 stem now defines SD;
item 20 key no longer quotes figures that the distractors lack.

Co-Authored-By: Claude Sonnet 5.5 <noreply@anthropic.com>
Claude-Session: https://claude.ai/code/session_01PqVbTUbfdZL6xorUhNeBpP
</commit_message>
<xml_diff>
--- a/makeup-exam/draft_makeup_exam.docx
+++ b/makeup-exam/draft_makeup_exam.docx
@@ -133,6 +133,7 @@
     </w:p>
     <w:tbl>
       <w:tblPr>
+        <w:tblStyle w:val="Table"/>
         <w:tblW w:type="pct" w:w="5000"/>
         <w:tblLook w:firstRow="1" w:lastRow="0" w:firstColumn="0" w:lastColumn="0" w:noHBand="0" w:noVBand="0" w:val="0020"/>
         <w:jc w:val="start"/>
@@ -642,13 +643,13 @@
         <w:pStyle w:val="BodyText"/>
       </w:pPr>
       <w:r>
-        <w:t xml:space="preserve">ก. เพศ ระดับชั้น อาชีพของผู้ปกครอง</w:t>
-      </w:r>
-      <w:r>
-        <w:br/>
-      </w:r>
-      <w:r>
-        <w:t xml:space="preserve">ข. น้ำหนัก ส่วนสูง จำนวนพี่น้อง</w:t>
+        <w:t xml:space="preserve">ก. เพศ ระดับชั้น อาชีพของผู้ปกครองนักเรียน</w:t>
+      </w:r>
+      <w:r>
+        <w:br/>
+      </w:r>
+      <w:r>
+        <w:t xml:space="preserve">ข. น้ำหนัก ส่วนสูง จำนวนพี่น้องของนักเรียน</w:t>
       </w:r>
       <w:r>
         <w:br/>
@@ -660,7 +661,7 @@
         <w:br/>
       </w:r>
       <w:r>
-        <w:t xml:space="preserve">ง. ศาสนา ภูมิลำเนา จังหวัดที่อยู่อาศัย</w:t>
+        <w:t xml:space="preserve">ง. ศาสนา ภูมิลำเนา จังหวัดที่อยู่อาศัยปัจจุบัน</w:t>
       </w:r>
     </w:p>
     <w:p>
@@ -738,25 +739,25 @@
         <w:pStyle w:val="BodyText"/>
       </w:pPr>
       <w:r>
-        <w:t xml:space="preserve">ก. เพราะเป็นตัวเลขที่มีจำนวนหลักมาก</w:t>
-      </w:r>
-      <w:r>
-        <w:br/>
-      </w:r>
-      <w:r>
-        <w:t xml:space="preserve">ข. เพราะไม่สามารถนำมาเรียงลำดับตามตัวอักษรได้</w:t>
-      </w:r>
-      <w:r>
-        <w:br/>
-      </w:r>
-      <w:r>
-        <w:t xml:space="preserve">ค. เพราะใช้ตัวเลขเพื่อระบุหรือจำแนกสมาชิก มิได้แสดงปริมาณหรือขนาด การนำมาบวก ลบ หรือหาค่าเฉลี่ยจึงไม่มีความหมาย</w:t>
-      </w:r>
-      <w:r>
-        <w:br/>
-      </w:r>
-      <w:r>
-        <w:t xml:space="preserve">ง. เพราะต้องเก็บรวบรวมข้อมูลด้วยการสัมภาษณ์เท่านั้น</w:t>
+        <w:t xml:space="preserve">ก. เพราะเป็นตัวเลขที่มีหลักจำนวนมาก จึงนำไปคำนวณทางสถิติไม่ได้</w:t>
+      </w:r>
+      <w:r>
+        <w:br/>
+      </w:r>
+      <w:r>
+        <w:t xml:space="preserve">ข. เพราะเป็นข้อมูลที่ได้จากการสัมภาษณ์ จึงไม่ใช่ข้อมูลเชิงปริมาณ</w:t>
+      </w:r>
+      <w:r>
+        <w:br/>
+      </w:r>
+      <w:r>
+        <w:t xml:space="preserve">ค. เพราะใช้ตัวเลขเพื่อระบุหรือจำแนกสมาชิก มิได้แสดงปริมาณหรือขนาด</w:t>
+      </w:r>
+      <w:r>
+        <w:br/>
+      </w:r>
+      <w:r>
+        <w:t xml:space="preserve">ง. เพราะเป็นตัวเลขที่เรียงลำดับไม่ได้ และมีค่าซ้ำกันไม่ได้เลย</w:t>
       </w:r>
     </w:p>
     <w:p>
@@ -954,19 +955,19 @@
         <w:br/>
       </w:r>
       <w:r>
-        <w:t xml:space="preserve">ข. มัธยฐาน</w:t>
-      </w:r>
-      <w:r>
-        <w:br/>
-      </w:r>
-      <w:r>
-        <w:t xml:space="preserve">ค. พิสัย</w:t>
-      </w:r>
-      <w:r>
-        <w:br/>
-      </w:r>
-      <w:r>
-        <w:t xml:space="preserve">ง. ฐานนิยม</w:t>
+        <w:t xml:space="preserve">ข. ค่ามัธยฐานของกลุ่ม</w:t>
+      </w:r>
+      <w:r>
+        <w:br/>
+      </w:r>
+      <w:r>
+        <w:t xml:space="preserve">ค. ค่าพิสัยของข้อมูล</w:t>
+      </w:r>
+      <w:r>
+        <w:br/>
+      </w:r>
+      <w:r>
+        <w:t xml:space="preserve">ง. ค่าฐานนิยมของกลุ่ม</w:t>
       </w:r>
     </w:p>
     <w:p>
@@ -1264,25 +1265,25 @@
         <w:pStyle w:val="BodyText"/>
       </w:pPr>
       <w:r>
-        <w:t xml:space="preserve">ก. คำนวณค่าเฉลี่ยเลขคณิตของคะแนนสอบได้ 72 คะแนน</w:t>
-      </w:r>
-      <w:r>
-        <w:br/>
-      </w:r>
-      <w:r>
-        <w:t xml:space="preserve">ข. คำนวณส่วนเบี่ยงเบนมาตรฐานของคะแนนสอบได้ 8.5 คะแนน</w:t>
-      </w:r>
-      <w:r>
-        <w:br/>
-      </w:r>
-      <w:r>
-        <w:t xml:space="preserve">ค. เรียงคะแนนสอบจากน้อยไปมากเพื่อหาค่ามัธยฐาน</w:t>
-      </w:r>
-      <w:r>
-        <w:br/>
-      </w:r>
-      <w:r>
-        <w:t xml:space="preserve">ง. สรุปว่าค่าเฉลี่ยของคะแนนต่ำกว่าเกณฑ์ที่กำหนด แสดงว่าผลสัมฤทธิ์โดยรวมของกลุ่มยังไม่ถึงเกณฑ์ที่คาดหวัง</w:t>
+        <w:t xml:space="preserve">ก. คำนวณค่าเฉลี่ยเลขคณิตของคะแนนสอบ ได้เท่ากับ 72 คะแนน</w:t>
+      </w:r>
+      <w:r>
+        <w:br/>
+      </w:r>
+      <w:r>
+        <w:t xml:space="preserve">ข. คำนวณส่วนเบี่ยงเบนมาตรฐานของคะแนนสอบ ได้ 8.5 คะแนน</w:t>
+      </w:r>
+      <w:r>
+        <w:br/>
+      </w:r>
+      <w:r>
+        <w:t xml:space="preserve">ค. เรียงคะแนนสอบจากน้อยไปมากเพื่อหาตำแหน่งของมัธยฐาน</w:t>
+      </w:r>
+      <w:r>
+        <w:br/>
+      </w:r>
+      <w:r>
+        <w:t xml:space="preserve">ง. สรุปว่าค่าเฉลี่ยต่ำกว่าเกณฑ์ ผลสัมฤทธิ์จึงยังไม่ถึงเกณฑ์</w:t>
       </w:r>
     </w:p>
     <w:p>
@@ -1370,25 +1371,25 @@
         <w:pStyle w:val="BodyText"/>
       </w:pPr>
       <w:r>
-        <w:t xml:space="preserve">ก. ได้รับอิทธิพลจากค่าสุดโต่งน้อยกว่ามัธยฐาน</w:t>
-      </w:r>
-      <w:r>
-        <w:br/>
-      </w:r>
-      <w:r>
-        <w:t xml:space="preserve">ข. ผลรวมของส่วนเบี่ยงเบนของข้อมูลทุกค่าจากค่าเฉลี่ยเลขคณิตมีค่าเท่ากับศูนย์</w:t>
-      </w:r>
-      <w:r>
-        <w:br/>
-      </w:r>
-      <w:r>
-        <w:t xml:space="preserve">ค. ต้องเป็นค่าที่ปรากฏอยู่ในข้อมูลชุดนั้นเสมอ</w:t>
-      </w:r>
-      <w:r>
-        <w:br/>
-      </w:r>
-      <w:r>
-        <w:t xml:space="preserve">ง. ใช้ได้กับข้อมูลเชิงคุณภาพทุกประเภท</w:t>
+        <w:t xml:space="preserve">ก. ได้รับอิทธิพลจากค่าสุดโต่งน้อยกว่ามัธยฐานเสมอ</w:t>
+      </w:r>
+      <w:r>
+        <w:br/>
+      </w:r>
+      <w:r>
+        <w:t xml:space="preserve">ข. ผลรวมของส่วนเบี่ยงเบนจากค่าเฉลี่ยของข้อมูลเท่ากับศูนย์</w:t>
+      </w:r>
+      <w:r>
+        <w:br/>
+      </w:r>
+      <w:r>
+        <w:t xml:space="preserve">ค. ต้องเป็นค่าที่ปรากฏอยู่ในข้อมูลชุดนั้นเสมอไปทุกกรณี</w:t>
+      </w:r>
+      <w:r>
+        <w:br/>
+      </w:r>
+      <w:r>
+        <w:t xml:space="preserve">ง. ใช้หาค่ากลางของข้อมูลเชิงคุณภาพได้ทุกประเภทอย่างเหมาะสม</w:t>
       </w:r>
     </w:p>
     <w:p>
@@ -1472,19 +1473,19 @@
         <w:br/>
       </w:r>
       <w:r>
-        <w:t xml:space="preserve">ข. ฐานนิยม เพราะเป็นค่าที่พบบ่อยที่สุด</w:t>
-      </w:r>
-      <w:r>
-        <w:br/>
-      </w:r>
-      <w:r>
-        <w:t xml:space="preserve">ค. มัธยฐาน เพราะไม่ถูกดึงด้วยค่าสุดโต่ง 85,000 บาท</w:t>
-      </w:r>
-      <w:r>
-        <w:br/>
-      </w:r>
-      <w:r>
-        <w:t xml:space="preserve">ง. พิสัย เพราะแสดงช่วงรายได้ทั้งหมด</w:t>
+        <w:t xml:space="preserve">ข. ฐานนิยม เพราะเป็นค่าที่พบบ่อยที่สุดในข้อมูล</w:t>
+      </w:r>
+      <w:r>
+        <w:br/>
+      </w:r>
+      <w:r>
+        <w:t xml:space="preserve">ค. มัธยฐาน เพราะไม่ถูกดึงด้วยค่าสุดโต่งของข้อมูล</w:t>
+      </w:r>
+      <w:r>
+        <w:br/>
+      </w:r>
+      <w:r>
+        <w:t xml:space="preserve">ง. พิสัย เพราะแสดงช่วงรายได้ทั้งหมดของพนักงาน</w:t>
       </w:r>
     </w:p>
     <w:p>
@@ -1562,25 +1563,25 @@
         <w:pStyle w:val="BodyText"/>
       </w:pPr>
       <w:r>
-        <w:t xml:space="preserve">ก. เพิ่มขึ้น 5 คะแนนทั้งสามค่า</w:t>
-      </w:r>
-      <w:r>
-        <w:br/>
-      </w:r>
-      <w:r>
-        <w:t xml:space="preserve">ข. เพิ่มขึ้นเฉพาะค่าเฉลี่ยเลขคณิต ส่วนมัธยฐานและฐานนิยมคงเดิม</w:t>
-      </w:r>
-      <w:r>
-        <w:br/>
-      </w:r>
-      <w:r>
-        <w:t xml:space="preserve">ค. คงเดิมทั้งสามค่า</w:t>
-      </w:r>
-      <w:r>
-        <w:br/>
-      </w:r>
-      <w:r>
-        <w:t xml:space="preserve">ง. เพิ่มขึ้นไม่เท่ากัน ขึ้นอยู่กับการกระจายของข้อมูล</w:t>
+        <w:t xml:space="preserve">ก. เพิ่มขึ้นเท่ากับ 5 คะแนนทั้งสามค่าพร้อมกัน</w:t>
+      </w:r>
+      <w:r>
+        <w:br/>
+      </w:r>
+      <w:r>
+        <w:t xml:space="preserve">ข. เพิ่มขึ้นเฉพาะค่าเฉลี่ย ส่วนอีกสองค่าคงเดิม</w:t>
+      </w:r>
+      <w:r>
+        <w:br/>
+      </w:r>
+      <w:r>
+        <w:t xml:space="preserve">ค. คงเดิมทั้งสามค่า เพราะเพิ่มให้ทุกคนเท่ากัน</w:t>
+      </w:r>
+      <w:r>
+        <w:br/>
+      </w:r>
+      <w:r>
+        <w:t xml:space="preserve">ง. เพิ่มขึ้นไม่เท่ากัน ขึ้นอยู่กับการกระจายข้อมูล</w:t>
       </w:r>
     </w:p>
     <w:p>
@@ -1658,7 +1659,7 @@
         <w:pStyle w:val="BodyText"/>
       </w:pPr>
       <w:r>
-        <w:t xml:space="preserve">ก. (M1 + M2) ÷ 2</w:t>
+        <w:t xml:space="preserve">ก. (M1 + M2) × (n1 + n2) ÷ 2</w:t>
       </w:r>
       <w:r>
         <w:br/>
@@ -1670,13 +1671,13 @@
         <w:br/>
       </w:r>
       <w:r>
-        <w:t xml:space="preserve">ค. (M1 + M2) ÷ (n1 + n2)</w:t>
-      </w:r>
-      <w:r>
-        <w:br/>
-      </w:r>
-      <w:r>
-        <w:t xml:space="preserve">ง. (n1 + n2) ÷ (M1 + M2)</w:t>
+        <w:t xml:space="preserve">ค. (n1·M1 + n2·M2) ÷ (n1·n2)</w:t>
+      </w:r>
+      <w:r>
+        <w:br/>
+      </w:r>
+      <w:r>
+        <w:t xml:space="preserve">ง. (M1 + M2) ÷ 2 (ไม่ใช้ n1, n2)</w:t>
       </w:r>
     </w:p>
     <w:p>
@@ -1728,7 +1729,7 @@
           <w:iCs/>
           <w:i/>
         </w:rPr>
-        <w:t xml:space="preserve">เหตุผล: ค่าเฉลี่ยรวมต้องถ่วงน้ำหนักด้วยจำนวนสมาชิกของแต่ละกลุ่ม สูตรตัวเลือก ก ใช้ได้เฉพาะกรณี n1 = n2</w:t>
+        <w:t xml:space="preserve">เหตุผล: ค่าเฉลี่ยรวมต้องถ่วงน้ำหนักด้วยจำนวนสมาชิกของแต่ละกลุ่ม การเฉลี่ยตรง ๆ แบบ (M1 + M2) ÷ 2 ใช้ได้เฉพาะกรณี n1 = n2</w:t>
       </w:r>
     </w:p>
     <w:p>
@@ -1754,25 +1755,25 @@
         <w:pStyle w:val="BodyText"/>
       </w:pPr>
       <w:r>
-        <w:t xml:space="preserve">ก. ข้อมูลตำแหน่งที่ 4</w:t>
-      </w:r>
-      <w:r>
-        <w:br/>
-      </w:r>
-      <w:r>
-        <w:t xml:space="preserve">ข. ข้อมูลตำแหน่งที่ 5</w:t>
-      </w:r>
-      <w:r>
-        <w:br/>
-      </w:r>
-      <w:r>
-        <w:t xml:space="preserve">ค. ค่าเฉลี่ยของข้อมูลตำแหน่งที่ 4 และตำแหน่งที่ 5</w:t>
-      </w:r>
-      <w:r>
-        <w:br/>
-      </w:r>
-      <w:r>
-        <w:t xml:space="preserve">ง. ค่าเฉลี่ยของข้อมูลตำแหน่งที่ 1 และตำแหน่งที่ 8</w:t>
+        <w:t xml:space="preserve">ก. ข้อมูลตำแหน่งที่ 4 เพียงค่าเดียว</w:t>
+      </w:r>
+      <w:r>
+        <w:br/>
+      </w:r>
+      <w:r>
+        <w:t xml:space="preserve">ข. ข้อมูลตำแหน่งที่ 5 เพียงค่าเดียว</w:t>
+      </w:r>
+      <w:r>
+        <w:br/>
+      </w:r>
+      <w:r>
+        <w:t xml:space="preserve">ค. ค่าเฉลี่ยของข้อมูลตำแหน่งที่ 4 และ 5</w:t>
+      </w:r>
+      <w:r>
+        <w:br/>
+      </w:r>
+      <w:r>
+        <w:t xml:space="preserve">ง. ค่าเฉลี่ยของข้อมูลตำแหน่งที่ 1 และ 8</w:t>
       </w:r>
     </w:p>
     <w:p>
@@ -2052,25 +2053,25 @@
         <w:pStyle w:val="BodyText"/>
       </w:pPr>
       <w:r>
-        <w:t xml:space="preserve">ก. เบ้ขวา ค่าเฉลี่ยเลขคณิตมากกว่ามัธยฐาน</w:t>
-      </w:r>
-      <w:r>
-        <w:br/>
-      </w:r>
-      <w:r>
-        <w:t xml:space="preserve">ข. สมมาตรรูประฆัง ค่าเฉลี่ยเลขคณิต มัธยฐาน และฐานนิยมมีค่าใกล้เคียงกัน</w:t>
-      </w:r>
-      <w:r>
-        <w:br/>
-      </w:r>
-      <w:r>
-        <w:t xml:space="preserve">ค. เบ้ซ้าย ค่าเฉลี่ยเลขคณิตน้อยกว่ามัธยฐาน</w:t>
-      </w:r>
-      <w:r>
-        <w:br/>
-      </w:r>
-      <w:r>
-        <w:t xml:space="preserve">ง. สมมาตรรูประฆัง แต่ค่าเฉลี่ยเลขคณิตมากกว่ามัธยฐานอย่างชัดเจน</w:t>
+        <w:t xml:space="preserve">ก. เบ้ขวา เพราะค่าเฉลี่ยเลขคณิตมากกว่ามัธยฐานมาก</w:t>
+      </w:r>
+      <w:r>
+        <w:br/>
+      </w:r>
+      <w:r>
+        <w:t xml:space="preserve">ข. สมมาตร เพราะค่าเฉลี่ย มัธยฐาน ฐานนิยมใกล้เคียงกัน</w:t>
+      </w:r>
+      <w:r>
+        <w:br/>
+      </w:r>
+      <w:r>
+        <w:t xml:space="preserve">ค. เบ้ซ้าย เพราะค่าเฉลี่ยเลขคณิตน้อยกว่ามัธยฐานมาก</w:t>
+      </w:r>
+      <w:r>
+        <w:br/>
+      </w:r>
+      <w:r>
+        <w:t xml:space="preserve">ง. สมมาตร แต่ค่าเฉลี่ยเลขคณิตมากกว่ามัธยฐานชัดเจน</w:t>
       </w:r>
     </w:p>
     <w:p>
@@ -2148,25 +2149,25 @@
         <w:pStyle w:val="BodyText"/>
       </w:pPr>
       <w:r>
-        <w:t xml:space="preserve">ก. การแจกแจงสมมาตร เพราะค่ากลางทั้งสองอยู่ในช่วงข้อมูลเดียวกัน</w:t>
-      </w:r>
-      <w:r>
-        <w:br/>
-      </w:r>
-      <w:r>
-        <w:t xml:space="preserve">ข. การแจกแจงเบ้ซ้าย เพราะมีข้อมูลบางส่วนที่มีค่าต่ำมาก</w:t>
-      </w:r>
-      <w:r>
-        <w:br/>
-      </w:r>
-      <w:r>
-        <w:t xml:space="preserve">ค. ข้อมูลคำนวณผิดพลาด เพราะค่าเฉลี่ยเลขคณิตและมัธยฐานต้องเท่ากันเสมอ</w:t>
-      </w:r>
-      <w:r>
-        <w:br/>
-      </w:r>
-      <w:r>
-        <w:t xml:space="preserve">ง. การแจกแจงเบ้ขวา เพราะมีข้อมูลบางส่วนที่มีค่าสูงมากดึงค่าเฉลี่ยเลขคณิตให้สูงกว่ามัธยฐาน</w:t>
+        <w:t xml:space="preserve">ก. สมมาตร เพราะค่ากลางทั้งสองอยู่ในช่วงข้อมูลเดียวกัน</w:t>
+      </w:r>
+      <w:r>
+        <w:br/>
+      </w:r>
+      <w:r>
+        <w:t xml:space="preserve">ข. เบ้ซ้าย เพราะมีข้อมูลบางส่วนมีค่าต่ำมากดึงค่าเฉลี่ย</w:t>
+      </w:r>
+      <w:r>
+        <w:br/>
+      </w:r>
+      <w:r>
+        <w:t xml:space="preserve">ค. ข้อมูลผิดพลาด เพราะค่าเฉลี่ยและมัธยฐานต้องเท่ากันเสมอ</w:t>
+      </w:r>
+      <w:r>
+        <w:br/>
+      </w:r>
+      <w:r>
+        <w:t xml:space="preserve">ง. เบ้ขวา เพราะมีค่าสูงมากบางส่วนดึงค่าเฉลี่ยให้สูงขึ้น</w:t>
       </w:r>
     </w:p>
     <w:p>
@@ -2254,13 +2255,13 @@
         <w:pStyle w:val="BodyText"/>
       </w:pPr>
       <w:r>
-        <w:t xml:space="preserve">ก. ห้อง A มีคะแนนกระจายมากกว่าห้อง B</w:t>
-      </w:r>
-      <w:r>
-        <w:br/>
-      </w:r>
-      <w:r>
-        <w:t xml:space="preserve">ข. ห้อง B มีคะแนนกระจายมากกว่า นักเรียนมีระดับคะแนนแตกต่างกันมากกว่าห้อง A</w:t>
+        <w:t xml:space="preserve">ก. ห้อง A มีคะแนนกระจายมากกว่า นักเรียนต่างกันมากกว่าห้อง B</w:t>
+      </w:r>
+      <w:r>
+        <w:br/>
+      </w:r>
+      <w:r>
+        <w:t xml:space="preserve">ข. ห้อง B มีคะแนนกระจายมากกว่า นักเรียนต่างกันมากกว่าห้อง A</w:t>
       </w:r>
       <w:r>
         <w:br/>
@@ -2350,25 +2351,25 @@
         <w:pStyle w:val="BodyText"/>
       </w:pPr>
       <w:r>
-        <w:t xml:space="preserve">ก. เพิ่มขึ้น 5 คะแนน</w:t>
-      </w:r>
-      <w:r>
-        <w:br/>
-      </w:r>
-      <w:r>
-        <w:t xml:space="preserve">ข. ลดลง 5 คะแนน</w:t>
-      </w:r>
-      <w:r>
-        <w:br/>
-      </w:r>
-      <w:r>
-        <w:t xml:space="preserve">ค. คงเดิม เพราะระยะห่างระหว่างข้อมูลแต่ละค่ากับค่าเฉลี่ยไม่เปลี่ยนแปลง</w:t>
-      </w:r>
-      <w:r>
-        <w:br/>
-      </w:r>
-      <w:r>
-        <w:t xml:space="preserve">ง. เพิ่มขึ้นตามสัดส่วนของค่าเฉลี่ย</w:t>
+        <w:t xml:space="preserve">ก. เพิ่มขึ้น 5 คะแนนเท่ากับค่าที่บวกเพิ่มให้ทุกคน</w:t>
+      </w:r>
+      <w:r>
+        <w:br/>
+      </w:r>
+      <w:r>
+        <w:t xml:space="preserve">ข. ลดลง เพราะคะแนนของทุกคนสูงขึ้นใกล้เคียงกันมากขึ้น</w:t>
+      </w:r>
+      <w:r>
+        <w:br/>
+      </w:r>
+      <w:r>
+        <w:t xml:space="preserve">ค. คงเดิม เพราะระยะห่างจากค่าเฉลี่ยของข้อมูลไม่เปลี่ยน</w:t>
+      </w:r>
+      <w:r>
+        <w:br/>
+      </w:r>
+      <w:r>
+        <w:t xml:space="preserve">ง. เพิ่มขึ้นตามสัดส่วนของค่าเฉลี่ยเลขคณิตใหม่ของกลุ่ม</w:t>
       </w:r>
     </w:p>
     <w:p>
@@ -2438,33 +2439,33 @@
         <w:t xml:space="preserve"> </w:t>
       </w:r>
       <w:r>
-        <w:t xml:space="preserve">ข้อใดอธิบายสัมประสิทธิ์ของการแปรผัน (CV) ได้ถูกต้องที่สุด</w:t>
-      </w:r>
-    </w:p>
-    <w:p>
-      <w:pPr>
-        <w:pStyle w:val="BodyText"/>
-      </w:pPr>
-      <w:r>
-        <w:t xml:space="preserve">ก. CV = ค่าเฉลี่ยเลขคณิต ÷ ส่วนเบี่ยงเบนมาตรฐาน ใช้เปรียบเทียบการกระจายเมื่อข้อมูลมีหน่วยหรือค่าเฉลี่ยแตกต่างกัน</w:t>
-      </w:r>
-      <w:r>
-        <w:br/>
-      </w:r>
-      <w:r>
-        <w:t xml:space="preserve">ข. CV = ส่วนเบี่ยงเบนมาตรฐาน × ค่าเฉลี่ยเลขคณิต ใช้บอกขนาดของข้อมูลชุดนั้น</w:t>
-      </w:r>
-      <w:r>
-        <w:br/>
-      </w:r>
-      <w:r>
-        <w:t xml:space="preserve">ค. CV = ส่วนเบี่ยงเบนมาตรฐาน ÷ ค่าเฉลี่ยเลขคณิต แต่ใช้ได้เฉพาะเมื่อข้อมูลสองชุดมีค่าเฉลี่ยเท่ากัน</w:t>
-      </w:r>
-      <w:r>
-        <w:br/>
-      </w:r>
-      <w:r>
-        <w:t xml:space="preserve">ง. CV = ส่วนเบี่ยงเบนมาตรฐาน ÷ ค่าเฉลี่ยเลขคณิต ใช้เปรียบเทียบการกระจายสัมพัทธ์เมื่อข้อมูลมีหน่วยหรือค่าเฉลี่ยแตกต่างกัน</w:t>
+        <w:t xml:space="preserve">ข้อใดอธิบายสัมประสิทธิ์ของการแปรผัน (CV) ได้ถูกต้องที่สุด (SD คือส่วนเบี่ยงเบนมาตรฐาน)</w:t>
+      </w:r>
+    </w:p>
+    <w:p>
+      <w:pPr>
+        <w:pStyle w:val="BodyText"/>
+      </w:pPr>
+      <w:r>
+        <w:t xml:space="preserve">ก. CV = ค่าเฉลี่ย ÷ SD ใช้เปรียบเทียบการกระจายของข้อมูลต่างหน่วยหรือต่างค่าเฉลี่ย</w:t>
+      </w:r>
+      <w:r>
+        <w:br/>
+      </w:r>
+      <w:r>
+        <w:t xml:space="preserve">ข. CV = SD × ค่าเฉลี่ย ใช้บอกขนาดโดยรวมของข้อมูลแต่ละชุดที่นำมาเปรียบเทียบ</w:t>
+      </w:r>
+      <w:r>
+        <w:br/>
+      </w:r>
+      <w:r>
+        <w:t xml:space="preserve">ค. CV = SD ÷ ค่าเฉลี่ย ใช้ได้เฉพาะเมื่อข้อมูลสองชุดมีค่าเฉลี่ยเท่ากันเท่านั้น</w:t>
+      </w:r>
+      <w:r>
+        <w:br/>
+      </w:r>
+      <w:r>
+        <w:t xml:space="preserve">ง. CV = SD ÷ ค่าเฉลี่ย ใช้เปรียบเทียบการกระจายของข้อมูลต่างหน่วยหรือต่างค่าเฉลี่ย</w:t>
       </w:r>
     </w:p>
     <w:p>
@@ -2542,25 +2543,25 @@
         <w:pStyle w:val="BodyText"/>
       </w:pPr>
       <w:r>
-        <w:t xml:space="preserve">ก. วิชา B มีการกระจายสัมพัทธ์น้อยกว่า เพราะ CV ของวิชา B (0.075) ต่ำกว่า CV ของวิชา A (0.10)</w:t>
-      </w:r>
-      <w:r>
-        <w:br/>
-      </w:r>
-      <w:r>
-        <w:t xml:space="preserve">ข. วิชา A มีการกระจายน้อยกว่า เพราะส่วนเบี่ยงเบนมาตรฐานต่ำกว่า</w:t>
-      </w:r>
-      <w:r>
-        <w:br/>
-      </w:r>
-      <w:r>
-        <w:t xml:space="preserve">ค. วิชา B มีการกระจายสัมพัทธ์มากกว่า เพราะส่วนเบี่ยงเบนมาตรฐานสูงกว่า</w:t>
-      </w:r>
-      <w:r>
-        <w:br/>
-      </w:r>
-      <w:r>
-        <w:t xml:space="preserve">ง. ไม่สามารถเปรียบเทียบได้ เพราะค่าเฉลี่ยของสองวิชาไม่เท่ากัน</w:t>
+        <w:t xml:space="preserve">ก. วิชา B กระจายสัมพัทธ์น้อยกว่า เพราะ CV ต่ำกว่าวิชา A</w:t>
+      </w:r>
+      <w:r>
+        <w:br/>
+      </w:r>
+      <w:r>
+        <w:t xml:space="preserve">ข. วิชา A กระจายน้อยกว่า เพราะส่วนเบี่ยงเบนมาตรฐานต่ำกว่า</w:t>
+      </w:r>
+      <w:r>
+        <w:br/>
+      </w:r>
+      <w:r>
+        <w:t xml:space="preserve">ค. วิชา B กระจายสัมพัทธ์มากกว่า เพราะส่วนเบี่ยงเบนมาตรฐานสูงกว่า</w:t>
+      </w:r>
+      <w:r>
+        <w:br/>
+      </w:r>
+      <w:r>
+        <w:t xml:space="preserve">ง. เปรียบเทียบไม่ได้ เพราะค่าเฉลี่ยของทั้งสองวิชาต่างกันมาก</w:t>
       </w:r>
     </w:p>
     <w:p>
@@ -2888,25 +2889,25 @@
         <w:pStyle w:val="BodyText"/>
       </w:pPr>
       <w:r>
-        <w:t xml:space="preserve">ก. สพฐ. มีสัดส่วนครูที่สอนภาษาไทยสูงกว่าภาพรวม</w:t>
-      </w:r>
-      <w:r>
-        <w:br/>
-      </w:r>
-      <w:r>
-        <w:t xml:space="preserve">ข. สถาบันบัณฑิตพัฒนศิลป์มีสัดส่วนครูที่สอนภาษาไทยสูงกว่าภาพรวมและสูงกว่าทุกสังกัด</w:t>
-      </w:r>
-      <w:r>
-        <w:br/>
-      </w:r>
-      <w:r>
-        <w:t xml:space="preserve">ค. เทศบาลและ สพฐ. มีครูที่สอนภาษาไทยจำนวนเท่ากัน (14 คน) จึงมีสัดส่วนเท่ากัน</w:t>
-      </w:r>
-      <w:r>
-        <w:br/>
-      </w:r>
-      <w:r>
-        <w:t xml:space="preserve">ง. เอกชนมีสัดส่วนครูที่สอนภาษาไทยต่ำกว่าภาพรวม</w:t>
+        <w:t xml:space="preserve">ก. สพฐ. มีสัดส่วนครูภาษาไทยสูงกว่าภาพรวมของครูทุกสังกัด</w:t>
+      </w:r>
+      <w:r>
+        <w:br/>
+      </w:r>
+      <w:r>
+        <w:t xml:space="preserve">ข. สถาบันบัณฑิตพัฒนศิลป์มีสัดส่วนสูงกว่าภาพรวมและทุกสังกัด</w:t>
+      </w:r>
+      <w:r>
+        <w:br/>
+      </w:r>
+      <w:r>
+        <w:t xml:space="preserve">ค. เทศบาลและ สพฐ. มีครูภาษาไทย 14 คนเท่ากัน จึงมีสัดส่วนเท่ากัน</w:t>
+      </w:r>
+      <w:r>
+        <w:br/>
+      </w:r>
+      <w:r>
+        <w:t xml:space="preserve">ง. เอกชนมีสัดส่วนครูภาษาไทยต่ำกว่าภาพรวมของครูทุกสังกัด</w:t>
       </w:r>
     </w:p>
     <w:p>
@@ -2984,25 +2985,25 @@
         <w:pStyle w:val="BodyText"/>
       </w:pPr>
       <w:r>
-        <w:t xml:space="preserve">ก. เพราะค่าร้อยละของทั้งสองสังกัดคำนวณผิดพลาด</w:t>
-      </w:r>
-      <w:r>
-        <w:br/>
-      </w:r>
-      <w:r>
-        <w:t xml:space="preserve">ข. เพราะค่าร้อยละไม่เกี่ยวข้องกับจำนวนครูทั้งหมดของแต่ละสังกัด</w:t>
-      </w:r>
-      <w:r>
-        <w:br/>
-      </w:r>
-      <w:r>
-        <w:t xml:space="preserve">ค. เพราะสังกัดเอกชนมีครูเพศชายมากกว่า สพฐ. หลายเท่า</w:t>
-      </w:r>
-      <w:r>
-        <w:br/>
-      </w:r>
-      <w:r>
-        <w:t xml:space="preserve">ง. เพราะจำนวนครูทั้งหมดของแต่ละสังกัดต่างกัน (เอกชน 43 คน, สพฐ. 75 คน) จึงมีฐานในการคำนวณร้อยละต่างกัน</w:t>
+        <w:t xml:space="preserve">ก. เพราะค่าร้อยละของทั้งสองสังกัดถูกคำนวณผิดพลาดทั้งคู่</w:t>
+      </w:r>
+      <w:r>
+        <w:br/>
+      </w:r>
+      <w:r>
+        <w:t xml:space="preserve">ข. เพราะค่าร้อยละไม่เกี่ยวข้องกับจำนวนครูทั้งหมดของสังกัด</w:t>
+      </w:r>
+      <w:r>
+        <w:br/>
+      </w:r>
+      <w:r>
+        <w:t xml:space="preserve">ค. เพราะสังกัดเอกชนมีครูเพศชายมากกว่า สพฐ. หลายเท่าตัว</w:t>
+      </w:r>
+      <w:r>
+        <w:br/>
+      </w:r>
+      <w:r>
+        <w:t xml:space="preserve">ง. เพราะจำนวนครูทั้งหมดของแต่ละสังกัดต่างกัน (43 และ 75 คน)</w:t>
       </w:r>
     </w:p>
     <w:p>
@@ -3291,6 +3292,7 @@
     </w:p>
     <w:tbl>
       <w:tblPr>
+        <w:tblStyle w:val="Table"/>
         <w:tblW w:type="auto" w:w="0"/>
         <w:tblLook w:firstRow="1" w:lastRow="0" w:firstColumn="0" w:lastColumn="0" w:noHBand="0" w:noVBand="0" w:val="0020"/>
         <w:jc w:val="start"/>

</xml_diff>